<commit_message>
docs: update ABET instruments and generation scripts from first to second grading period
</commit_message>
<xml_diff>
--- a/education/evidencias_abet/INSTRUMENTO_ABET_TALLER_LOCALIZACION_APRILTAG_MICROROS.docx
+++ b/education/evidencias_abet/INSTRUMENTO_ABET_TALLER_LOCALIZACION_APRILTAG_MICROROS.docx
@@ -281,7 +281,7 @@
                 <w:b w:val="0"/>
                 <w:sz w:val="15"/>
               </w:rPr>
-              <w:t>Primer Corte / Talleres y tareas</w:t>
+              <w:t>Segundo Corte / Talleres y tareas</w:t>
             </w:r>
           </w:p>
         </w:tc>
@@ -605,7 +605,7 @@
                 <w:b w:val="0"/>
                 <w:sz w:val="15"/>
               </w:rPr>
-              <w:t>C1_T_APRILTAG_G&lt;grupo&gt;_&lt;codigo1&gt;_&lt;codigo2&gt;_v1.docx</w:t>
+              <w:t>C2_T_APRILTAG_G&lt;grupo&gt;_&lt;codigo1&gt;_&lt;codigo2&gt;_v1.docx</w:t>
             </w:r>
           </w:p>
         </w:tc>
@@ -960,7 +960,7 @@
                 <w:b w:val="0"/>
                 <w:sz w:val="15"/>
               </w:rPr>
-              <w:t>Primer corte, tras la ejecución de las fases de visión, homografía y lazo embebido.</w:t>
+              <w:t>Segundo corte, tras la ejecución de las fases de visión, homografía y lazo embebido.</w:t>
             </w:r>
           </w:p>
         </w:tc>
@@ -8974,7 +8974,7 @@
                 <w:b w:val="0"/>
                 <w:sz w:val="16"/>
               </w:rPr>
-              <w:t>Nota Académica sobre 5,0 = Nota Consolidada sobre 500 ÷ 100. Aporte a Talleres del Primer Corte: T₁ = Nota Académica sobre 5,0.</w:t>
+              <w:t>Nota Académica sobre 5,0 = Nota Consolidada sobre 500 ÷ 100. Aporte a Talleres del Segundo Corte: T₂ = Nota Académica sobre 5,0 (Componente T_C2).</w:t>
             </w:r>
           </w:p>
         </w:tc>

</xml_diff>